<commit_message>
Clarify hosting scope: AWS Commercial, us-east-2
- SDR v1.2: MAS-CSO-IIR names AWS Commercial us-east-2 as the hosting
  environment and excludes other regions (including Europe) and the
  AWS GovCloud (US) proof of concept
- SDR: backups described as replicated across availability zones
  (MAS-CSO-IIR, KSI-SVC-SIN), matching the SOC 2 description
- Public Information JSON and readable version: replace 'dedicated
  environment' wording with hosting location

Co-Authored-By: Claude Opus 5.5 <noreply@anthropic.com>
Claude-Session: https://claude.ai/code/session_01QqdRwbgxpbgZLeo3nnYUym
</commit_message>
<xml_diff>
--- a/JupiterOne_Public_Information_Readable.docx
+++ b/JupiterOne_Public_Information_Readable.docx
@@ -62,7 +62,7 @@
           <w:szCs w:val="20"/>
           <w:rtl w:val="0"/>
         </w:rPr>
-        <w:t xml:space="preserve">Human-readable counterpart to fedramp-public-information-final.json — last updated 2026-08-10</w:t>
+        <w:t xml:space="preserve">Human-readable counterpart to fedramp-public-information-final.json — last updated 2026-10-30</w:t>
       </w:r>
       <w:r>
         <w:rPr>
@@ -1300,7 +1300,7 @@
         <w:rPr>
           <w:rtl w:val="0"/>
         </w:rPr>
-        <w:t xml:space="preserve">JupiterOne GovCloud is the government-focused deployment of the JupiterOne cyber asset attack surface management platform, providing federal customers with continuous asset visibility, relationship mapping, and compliance evidence management within a dedicated environment aligned to FedRAMP requirements.</w:t>
+        <w:t xml:space="preserve">JupiterOne GovCloud is the government-focused deployment of the JupiterOne cyber asset attack surface management platform, providing federal customers with continuous asset visibility, relationship mapping, and compliance evidence management. Hosted in AWS Commercial in the us-east-2 region.</w:t>
       </w:r>
     </w:p>
     <w:p>

</xml_diff>